<commit_message>
notes/. - Updated 'syllabus - Python 3 Prgmg Splzn.docx'
It listed the 5 courses in the course series 'Python 3 Programming Specialization'
    by Michigan University via Coursera.
</commit_message>
<xml_diff>
--- a/Course 1 - Python Basics/notes/syllabus - Python 3 Prgmg Splzn.docx
+++ b/Course 1 - Python Basics/notes/syllabus - Python 3 Prgmg Splzn.docx
@@ -1,6 +1,6 @@
 
 <file path=word/document.xml><?xml version="1.0" encoding="utf-8"?>
-<w:document xmlns:wpc="http://schemas.microsoft.com/office/word/2010/wordprocessingCanvas" xmlns:cx="http://schemas.microsoft.com/office/drawing/2014/chartex" xmlns:cx1="http://schemas.microsoft.com/office/drawing/2015/9/8/chartex" xmlns:cx2="http://schemas.microsoft.com/office/drawing/2015/10/21/chartex" xmlns:cx3="http://schemas.microsoft.com/office/drawing/2016/5/9/chartex" xmlns:cx4="http://schemas.microsoft.com/office/drawing/2016/5/10/chartex" xmlns:cx5="http://schemas.microsoft.com/office/drawing/2016/5/11/chartex" xmlns:cx6="http://schemas.microsoft.com/office/drawing/2016/5/12/chartex" xmlns:cx7="http://schemas.microsoft.com/office/drawing/2016/5/13/chartex" xmlns:cx8="http://schemas.microsoft.com/office/drawing/2016/5/14/chartex" xmlns:mc="http://schemas.openxmlformats.org/markup-compatibility/2006" xmlns:aink="http://schemas.microsoft.com/office/drawing/2016/ink" xmlns:am3d="http://schemas.microsoft.com/office/drawing/2017/model3d" xmlns:o="urn:schemas-microsoft-com:office:office" xmlns:oel="http://schemas.microsoft.com/office/2019/extlst" xmlns:r="http://schemas.openxmlformats.org/officeDocument/2006/relationships" xmlns:m="http://schemas.openxmlformats.org/officeDocument/2006/math" xmlns:v="urn:schemas-microsoft-com:vml" xmlns:wp14="http://schemas.microsoft.com/office/word/2010/wordprocessingDrawing" xmlns:wp="http://schemas.openxmlformats.org/drawingml/2006/wordprocessingDrawing" xmlns:w10="urn:schemas-microsoft-com:office:word" xmlns:w="http://schemas.openxmlformats.org/wordprocessingml/2006/main" xmlns:w14="http://schemas.microsoft.com/office/word/2010/wordml" xmlns:w15="http://schemas.microsoft.com/office/word/2012/wordml" xmlns:w16cex="http://schemas.microsoft.com/office/word/2018/wordml/cex" xmlns:w16cid="http://schemas.microsoft.com/office/word/2016/wordml/cid" xmlns:w16="http://schemas.microsoft.com/office/word/2018/wordml" xmlns:w16du="http://schemas.microsoft.com/office/word/2023/wordml/word16du" xmlns:w16sdtdh="http://schemas.microsoft.com/office/word/2020/wordml/sdtdatahash" xmlns:w16sdtfl="http://schemas.microsoft.com/office/word/2024/wordml/sdtformatlock" xmlns:w16se="http://schemas.microsoft.com/office/word/2015/wordml/symex" xmlns:wpg="http://schemas.microsoft.com/office/word/2010/wordprocessingGroup" xmlns:wpi="http://schemas.microsoft.com/office/word/2010/wordprocessingInk" xmlns:wne="http://schemas.microsoft.com/office/word/2006/wordml" xmlns:wps="http://schemas.microsoft.com/office/word/2010/wordprocessingShape" mc:Ignorable="w14 w15 w16se w16cid w16 w16cex w16sdtdh w16sdtfl w16du wp14">
+<w:document xmlns:wpc="http://schemas.microsoft.com/office/word/2010/wordprocessingCanvas" xmlns:cx="http://schemas.microsoft.com/office/drawing/2014/chartex" xmlns:cx1="http://schemas.microsoft.com/office/drawing/2015/9/8/chartex" xmlns:cx2="http://schemas.microsoft.com/office/drawing/2015/10/21/chartex" xmlns:cx3="http://schemas.microsoft.com/office/drawing/2016/5/9/chartex" xmlns:cx4="http://schemas.microsoft.com/office/drawing/2016/5/10/chartex" xmlns:cx5="http://schemas.microsoft.com/office/drawing/2016/5/11/chartex" xmlns:cx6="http://schemas.microsoft.com/office/drawing/2016/5/12/chartex" xmlns:cx7="http://schemas.microsoft.com/office/drawing/2016/5/13/chartex" xmlns:cx8="http://schemas.microsoft.com/office/drawing/2016/5/14/chartex" xmlns:mc="http://schemas.openxmlformats.org/markup-compatibility/2006" xmlns:aink="http://schemas.microsoft.com/office/drawing/2016/ink" xmlns:am3d="http://schemas.microsoft.com/office/drawing/2017/model3d" xmlns:o="urn:schemas-microsoft-com:office:office" xmlns:oel="http://schemas.microsoft.com/office/2019/extlst" xmlns:r="http://schemas.openxmlformats.org/officeDocument/2006/relationships" xmlns:m="http://schemas.openxmlformats.org/officeDocument/2006/math" xmlns:v="urn:schemas-microsoft-com:vml" xmlns:wp14="http://schemas.microsoft.com/office/word/2010/wordprocessingDrawing" xmlns:wp="http://schemas.openxmlformats.org/drawingml/2006/wordprocessingDrawing" xmlns:w10="urn:schemas-microsoft-com:office:word" xmlns:w="http://schemas.openxmlformats.org/wordprocessingml/2006/main" xmlns:w14="http://schemas.microsoft.com/office/word/2010/wordml" xmlns:w15="http://schemas.microsoft.com/office/word/2012/wordml" xmlns:w16cei="http://schemas.microsoft.com/office/word/2026/wordml/cei" xmlns:w16cex="http://schemas.microsoft.com/office/word/2018/wordml/cex" xmlns:w16cid="http://schemas.microsoft.com/office/word/2016/wordml/cid" xmlns:w16="http://schemas.microsoft.com/office/word/2018/wordml" xmlns:w16du="http://schemas.microsoft.com/office/word/2023/wordml/word16du" xmlns:w16sdtdh="http://schemas.microsoft.com/office/word/2020/wordml/sdtdatahash" xmlns:w16sdtfl="http://schemas.microsoft.com/office/word/2024/wordml/sdtformatlock" xmlns:w16se="http://schemas.microsoft.com/office/word/2015/wordml/symex" xmlns:wpg="http://schemas.microsoft.com/office/word/2010/wordprocessingGroup" xmlns:wpi="http://schemas.microsoft.com/office/word/2010/wordprocessingInk" xmlns:wne="http://schemas.microsoft.com/office/word/2006/wordml" xmlns:wps="http://schemas.microsoft.com/office/word/2010/wordprocessingShape" mc:Ignorable="w14 w15 w16se w16cid w16 w16cex w16sdtdh w16sdtfl w16du wp14">
   <w:body>
     <w:p>
       <w:pPr>
@@ -18,19 +18,184 @@
         </w:rPr>
         <w:t>Python 3 Programming Specialization</w:t>
       </w:r>
-      <w:r>
+    </w:p>
+    <w:p>
+      <w:pPr>
+        <w:spacing w:after="120"/>
+      </w:pPr>
+      <w:r>
+        <w:t xml:space="preserve">The </w:t>
+      </w:r>
+      <w:hyperlink r:id="rId7" w:tgtFrame="_blank" w:history="1">
+        <w:r>
+          <w:rPr>
+            <w:rStyle w:val="Hyperlink"/>
+          </w:rPr>
+          <w:t>Python 3 Programming Specialization</w:t>
+        </w:r>
+      </w:hyperlink>
+      <w:r>
+        <w:t xml:space="preserve"> on Coursera, offered by the University of Michigan, consists of five core courses: Python Basics, Python Functions, Files, and Dictionaries, Data Collection and Processing with Python, Python Classes and Inheritance, and Python Project: Software Engineering and Image Manipulation.</w:t>
+      </w:r>
+    </w:p>
+    <w:p>
+      <w:pPr>
+        <w:spacing w:after="120"/>
         <w:rPr>
           <w:b/>
           <w:bCs/>
         </w:rPr>
-        <w:t xml:space="preserve"> - </w:t>
-      </w:r>
+      </w:pPr>
       <w:r>
         <w:rPr>
           <w:b/>
           <w:bCs/>
         </w:rPr>
-        <w:t>Course Syllabus</w:t>
+        <w:t>Course List</w:t>
+      </w:r>
+    </w:p>
+    <w:p>
+      <w:pPr>
+        <w:numPr>
+          <w:ilvl w:val="0"/>
+          <w:numId w:val="31"/>
+        </w:numPr>
+        <w:spacing w:after="120"/>
+      </w:pPr>
+      <w:r>
+        <w:rPr>
+          <w:b/>
+          <w:bCs/>
+        </w:rPr>
+        <w:t>Python Basics</w:t>
+      </w:r>
+      <w:r>
+        <w:t>: Covers fundamental syntax, variables, conditionals, loops, and basic logic.</w:t>
+      </w:r>
+    </w:p>
+    <w:p>
+      <w:pPr>
+        <w:numPr>
+          <w:ilvl w:val="0"/>
+          <w:numId w:val="31"/>
+        </w:numPr>
+        <w:spacing w:after="120"/>
+      </w:pPr>
+      <w:r>
+        <w:rPr>
+          <w:b/>
+          <w:bCs/>
+        </w:rPr>
+        <w:t>Python Functions, Files, and Dictionaries</w:t>
+      </w:r>
+      <w:r>
+        <w:t>: Teaches how to write custom functions, read and write files, and use advanced data structures like dictionaries.</w:t>
+      </w:r>
+    </w:p>
+    <w:p>
+      <w:pPr>
+        <w:numPr>
+          <w:ilvl w:val="0"/>
+          <w:numId w:val="31"/>
+        </w:numPr>
+        <w:spacing w:after="120"/>
+      </w:pPr>
+      <w:r>
+        <w:rPr>
+          <w:b/>
+          <w:bCs/>
+        </w:rPr>
+        <w:t>Data Collection and Processing with Python</w:t>
+      </w:r>
+      <w:r>
+        <w:t>: Focuses on gathering data from APIs, handling nested data, and processing information using JSON and advanced iteration.</w:t>
+      </w:r>
+    </w:p>
+    <w:p>
+      <w:pPr>
+        <w:numPr>
+          <w:ilvl w:val="0"/>
+          <w:numId w:val="31"/>
+        </w:numPr>
+        <w:spacing w:after="120"/>
+      </w:pPr>
+      <w:r>
+        <w:rPr>
+          <w:b/>
+          <w:bCs/>
+        </w:rPr>
+        <w:t>Python Classes and Inheritance</w:t>
+      </w:r>
+      <w:r>
+        <w:t>: Introduces object-oriented programming, defining classes, writing methods, and reusing code via inheritance.</w:t>
+      </w:r>
+    </w:p>
+    <w:p>
+      <w:pPr>
+        <w:numPr>
+          <w:ilvl w:val="0"/>
+          <w:numId w:val="31"/>
+        </w:numPr>
+        <w:spacing w:after="120"/>
+      </w:pPr>
+      <w:r>
+        <w:rPr>
+          <w:b/>
+          <w:bCs/>
+        </w:rPr>
+        <w:t>Python Project: Software Engineering and Image Manipulation</w:t>
+      </w:r>
+      <w:r>
+        <w:t>: A capstone project applying software design principles and using external libraries like Pillow, Tesseract, and OpenCV</w:t>
+      </w:r>
+    </w:p>
+    <w:p>
+      <w:pPr>
+        <w:spacing w:after="120"/>
+      </w:pPr>
+    </w:p>
+    <w:p>
+      <w:pPr>
+        <w:jc w:val="center"/>
+        <w:rPr>
+          <w:b/>
+          <w:bCs/>
+        </w:rPr>
+      </w:pPr>
+      <w:r>
+        <w:rPr>
+          <w:b/>
+          <w:bCs/>
+        </w:rPr>
+        <w:t>Syllabus</w:t>
+      </w:r>
+      <w:r>
+        <w:rPr>
+          <w:b/>
+          <w:bCs/>
+        </w:rPr>
+        <w:t xml:space="preserve"> for </w:t>
+      </w:r>
+      <w:r>
+        <w:rPr>
+          <w:b/>
+          <w:bCs/>
+        </w:rPr>
+        <w:t>Course</w:t>
+      </w:r>
+      <w:r>
+        <w:rPr>
+          <w:b/>
+          <w:bCs/>
+        </w:rPr>
+        <w:t xml:space="preserve"> 1 - </w:t>
+      </w:r>
+      <w:r>
+        <w:rPr>
+          <w:b/>
+          <w:bCs/>
+        </w:rPr>
+        <w:t>Python Basics</w:t>
       </w:r>
     </w:p>
     <w:p>
@@ -90,6 +255,21 @@
     </w:p>
     <w:p>
       <w:pPr>
+        <w:rPr>
+          <w:b/>
+          <w:bCs/>
+        </w:rPr>
+      </w:pPr>
+      <w:r>
+        <w:rPr>
+          <w:b/>
+          <w:bCs/>
+        </w:rPr>
+        <w:br w:type="page"/>
+      </w:r>
+    </w:p>
+    <w:p>
+      <w:pPr>
         <w:spacing w:after="60"/>
         <w:rPr>
           <w:b/>
@@ -101,6 +281,7 @@
           <w:b/>
           <w:bCs/>
         </w:rPr>
+        <w:lastRenderedPageBreak/>
         <w:t xml:space="preserve">Course Schedule &amp; Grading Policy </w:t>
       </w:r>
     </w:p>
@@ -230,15 +411,7 @@
         <w:t>In week three</w:t>
       </w:r>
       <w:r>
-        <w:t xml:space="preserve"> you will learn a new python data type - the </w:t>
-      </w:r>
-      <w:proofErr w:type="spellStart"/>
-      <w:r>
-        <w:t>boolean</w:t>
-      </w:r>
-      <w:proofErr w:type="spellEnd"/>
-      <w:r>
-        <w:t xml:space="preserve"> - as well as another control structure - conditional execution. Through the use of video lectures and the Runestone textbook, you will learn what Binary, Unary, Nested, and Chained Conditionals are, as well as how to incorporate conditionals within an accumulation pattern.</w:t>
+        <w:t xml:space="preserve"> you will learn a new python data type - the boolean - as well as another control structure - conditional execution. Through the use of video lectures and the Runestone textbook, you will learn what Binary, Unary, Nested, and Chained Conditionals are, as well as how to incorporate conditionals within an accumulation pattern.</w:t>
       </w:r>
     </w:p>
     <w:p>
@@ -250,7 +423,6 @@
         <w:spacing w:after="60"/>
       </w:pPr>
       <w:r>
-        <w:lastRenderedPageBreak/>
         <w:t>Assessment - Week Three (10%)</w:t>
       </w:r>
     </w:p>
@@ -397,6 +569,7 @@
           <w:b/>
           <w:bCs/>
         </w:rPr>
+        <w:lastRenderedPageBreak/>
         <w:t>Stay curious:</w:t>
       </w:r>
       <w:r>
@@ -448,7 +621,7 @@
       <w:r>
         <w:t xml:space="preserve">We expect all learners to abide by our full </w:t>
       </w:r>
-      <w:hyperlink r:id="rId7" w:tgtFrame="_blank" w:history="1">
+      <w:hyperlink r:id="rId8" w:tgtFrame="_blank" w:history="1">
         <w:r>
           <w:rPr>
             <w:rStyle w:val="Hyperlink"/>
@@ -457,15 +630,7 @@
         </w:r>
       </w:hyperlink>
       <w:r>
-        <w:t xml:space="preserve">. We will specifically be monitoring this course for language that could be considered inflammatory, </w:t>
-      </w:r>
-      <w:proofErr w:type="spellStart"/>
-      <w:r>
-        <w:t>incivil</w:t>
-      </w:r>
-      <w:proofErr w:type="spellEnd"/>
-      <w:r>
-        <w:t>, racist, or otherwise unacceptable for this learning space, and we will remove language deemed such.</w:t>
+        <w:t>. We will specifically be monitoring this course for language that could be considered inflammatory, incivil, racist, or otherwise unacceptable for this learning space, and we will remove language deemed such.</w:t>
       </w:r>
     </w:p>
     <w:p>
@@ -528,7 +693,6 @@
         <w:spacing w:after="60"/>
       </w:pPr>
       <w:r>
-        <w:lastRenderedPageBreak/>
         <w:t>Copying answers or copying from your peers within the course</w:t>
       </w:r>
     </w:p>
@@ -627,7 +791,7 @@
       <w:r>
         <w:t>Questions and discussion of course material should take place within the course itself. Please do not contact instructors or teaching assistants off the platform, as responding to individual questions is virtually impossible. We encourage you to direct your questions to the </w:t>
       </w:r>
-      <w:hyperlink r:id="rId8" w:tgtFrame="_blank" w:history="1">
+      <w:hyperlink r:id="rId9" w:tgtFrame="_blank" w:history="1">
         <w:r>
           <w:rPr>
             <w:rStyle w:val="Hyperlink"/>
@@ -636,9 +800,13 @@
         </w:r>
       </w:hyperlink>
       <w:r>
-        <w:t xml:space="preserve">, where your question might be answered by a fellow learner or one of our course team members. For technical help please contact the </w:t>
-      </w:r>
-      <w:hyperlink r:id="rId9" w:tgtFrame="_blank" w:history="1">
+        <w:t xml:space="preserve">, where your question </w:t>
+      </w:r>
+      <w:r>
+        <w:lastRenderedPageBreak/>
+        <w:t xml:space="preserve">might be answered by a fellow learner or one of our course team members. For technical help please contact the </w:t>
+      </w:r>
+      <w:hyperlink r:id="rId10" w:tgtFrame="_blank" w:history="1">
         <w:r>
           <w:rPr>
             <w:rStyle w:val="Hyperlink"/>
@@ -681,7 +849,7 @@
       <w:r>
         <w:t xml:space="preserve">Please use the </w:t>
       </w:r>
-      <w:hyperlink r:id="rId10" w:tgtFrame="_blank" w:history="1">
+      <w:hyperlink r:id="rId11" w:tgtFrame="_blank" w:history="1">
         <w:r>
           <w:rPr>
             <w:rStyle w:val="Hyperlink"/>
@@ -738,7 +906,7 @@
       </w:pPr>
     </w:p>
     <w:sectPr>
-      <w:footerReference w:type="default" r:id="rId11"/>
+      <w:footerReference w:type="default" r:id="rId12"/>
       <w:pgSz w:w="12240" w:h="15840" w:code="1"/>
       <w:pgMar w:top="1080" w:right="432" w:bottom="360" w:left="1440" w:header="706" w:footer="216" w:gutter="0"/>
       <w:cols w:space="708"/>
@@ -749,7 +917,7 @@
 </file>
 
 <file path=word/endnotes.xml><?xml version="1.0" encoding="utf-8"?>
-<w:endnotes xmlns:wpc="http://schemas.microsoft.com/office/word/2010/wordprocessingCanvas" xmlns:cx="http://schemas.microsoft.com/office/drawing/2014/chartex" xmlns:cx1="http://schemas.microsoft.com/office/drawing/2015/9/8/chartex" xmlns:cx2="http://schemas.microsoft.com/office/drawing/2015/10/21/chartex" xmlns:cx3="http://schemas.microsoft.com/office/drawing/2016/5/9/chartex" xmlns:cx4="http://schemas.microsoft.com/office/drawing/2016/5/10/chartex" xmlns:cx5="http://schemas.microsoft.com/office/drawing/2016/5/11/chartex" xmlns:cx6="http://schemas.microsoft.com/office/drawing/2016/5/12/chartex" xmlns:cx7="http://schemas.microsoft.com/office/drawing/2016/5/13/chartex" xmlns:cx8="http://schemas.microsoft.com/office/drawing/2016/5/14/chartex" xmlns:mc="http://schemas.openxmlformats.org/markup-compatibility/2006" xmlns:aink="http://schemas.microsoft.com/office/drawing/2016/ink" xmlns:am3d="http://schemas.microsoft.com/office/drawing/2017/model3d" xmlns:o="urn:schemas-microsoft-com:office:office" xmlns:oel="http://schemas.microsoft.com/office/2019/extlst" xmlns:r="http://schemas.openxmlformats.org/officeDocument/2006/relationships" xmlns:m="http://schemas.openxmlformats.org/officeDocument/2006/math" xmlns:v="urn:schemas-microsoft-com:vml" xmlns:wp14="http://schemas.microsoft.com/office/word/2010/wordprocessingDrawing" xmlns:wp="http://schemas.openxmlformats.org/drawingml/2006/wordprocessingDrawing" xmlns:w10="urn:schemas-microsoft-com:office:word" xmlns:w="http://schemas.openxmlformats.org/wordprocessingml/2006/main" xmlns:w14="http://schemas.microsoft.com/office/word/2010/wordml" xmlns:w15="http://schemas.microsoft.com/office/word/2012/wordml" xmlns:w16cex="http://schemas.microsoft.com/office/word/2018/wordml/cex" xmlns:w16cid="http://schemas.microsoft.com/office/word/2016/wordml/cid" xmlns:w16="http://schemas.microsoft.com/office/word/2018/wordml" xmlns:w16du="http://schemas.microsoft.com/office/word/2023/wordml/word16du" xmlns:w16sdtdh="http://schemas.microsoft.com/office/word/2020/wordml/sdtdatahash" xmlns:w16sdtfl="http://schemas.microsoft.com/office/word/2024/wordml/sdtformatlock" xmlns:w16se="http://schemas.microsoft.com/office/word/2015/wordml/symex" xmlns:wpg="http://schemas.microsoft.com/office/word/2010/wordprocessingGroup" xmlns:wpi="http://schemas.microsoft.com/office/word/2010/wordprocessingInk" xmlns:wne="http://schemas.microsoft.com/office/word/2006/wordml" xmlns:wps="http://schemas.microsoft.com/office/word/2010/wordprocessingShape" mc:Ignorable="w14 w15 w16se w16cid w16 w16cex w16sdtdh w16sdtfl w16du wp14">
+<w:endnotes xmlns:wpc="http://schemas.microsoft.com/office/word/2010/wordprocessingCanvas" xmlns:cx="http://schemas.microsoft.com/office/drawing/2014/chartex" xmlns:cx1="http://schemas.microsoft.com/office/drawing/2015/9/8/chartex" xmlns:cx2="http://schemas.microsoft.com/office/drawing/2015/10/21/chartex" xmlns:cx3="http://schemas.microsoft.com/office/drawing/2016/5/9/chartex" xmlns:cx4="http://schemas.microsoft.com/office/drawing/2016/5/10/chartex" xmlns:cx5="http://schemas.microsoft.com/office/drawing/2016/5/11/chartex" xmlns:cx6="http://schemas.microsoft.com/office/drawing/2016/5/12/chartex" xmlns:cx7="http://schemas.microsoft.com/office/drawing/2016/5/13/chartex" xmlns:cx8="http://schemas.microsoft.com/office/drawing/2016/5/14/chartex" xmlns:mc="http://schemas.openxmlformats.org/markup-compatibility/2006" xmlns:aink="http://schemas.microsoft.com/office/drawing/2016/ink" xmlns:am3d="http://schemas.microsoft.com/office/drawing/2017/model3d" xmlns:o="urn:schemas-microsoft-com:office:office" xmlns:oel="http://schemas.microsoft.com/office/2019/extlst" xmlns:r="http://schemas.openxmlformats.org/officeDocument/2006/relationships" xmlns:m="http://schemas.openxmlformats.org/officeDocument/2006/math" xmlns:v="urn:schemas-microsoft-com:vml" xmlns:wp14="http://schemas.microsoft.com/office/word/2010/wordprocessingDrawing" xmlns:wp="http://schemas.openxmlformats.org/drawingml/2006/wordprocessingDrawing" xmlns:w10="urn:schemas-microsoft-com:office:word" xmlns:w="http://schemas.openxmlformats.org/wordprocessingml/2006/main" xmlns:w14="http://schemas.microsoft.com/office/word/2010/wordml" xmlns:w15="http://schemas.microsoft.com/office/word/2012/wordml" xmlns:w16cei="http://schemas.microsoft.com/office/word/2026/wordml/cei" xmlns:w16cex="http://schemas.microsoft.com/office/word/2018/wordml/cex" xmlns:w16cid="http://schemas.microsoft.com/office/word/2016/wordml/cid" xmlns:w16="http://schemas.microsoft.com/office/word/2018/wordml" xmlns:w16du="http://schemas.microsoft.com/office/word/2023/wordml/word16du" xmlns:w16sdtdh="http://schemas.microsoft.com/office/word/2020/wordml/sdtdatahash" xmlns:w16sdtfl="http://schemas.microsoft.com/office/word/2024/wordml/sdtformatlock" xmlns:w16se="http://schemas.microsoft.com/office/word/2015/wordml/symex" xmlns:wpg="http://schemas.microsoft.com/office/word/2010/wordprocessingGroup" xmlns:wpi="http://schemas.microsoft.com/office/word/2010/wordprocessingInk" xmlns:wne="http://schemas.microsoft.com/office/word/2006/wordml" xmlns:wps="http://schemas.microsoft.com/office/word/2010/wordprocessingShape" mc:Ignorable="w14 w15 w16se w16cid w16 w16cex w16sdtdh w16sdtfl w16du wp14">
   <w:endnote w:type="separator" w:id="-1">
     <w:p>
       <w:pPr>
@@ -774,7 +942,7 @@
 </file>
 
 <file path=word/footer1.xml><?xml version="1.0" encoding="utf-8"?>
-<w:ftr xmlns:wpc="http://schemas.microsoft.com/office/word/2010/wordprocessingCanvas" xmlns:cx="http://schemas.microsoft.com/office/drawing/2014/chartex" xmlns:cx1="http://schemas.microsoft.com/office/drawing/2015/9/8/chartex" xmlns:cx2="http://schemas.microsoft.com/office/drawing/2015/10/21/chartex" xmlns:cx3="http://schemas.microsoft.com/office/drawing/2016/5/9/chartex" xmlns:cx4="http://schemas.microsoft.com/office/drawing/2016/5/10/chartex" xmlns:cx5="http://schemas.microsoft.com/office/drawing/2016/5/11/chartex" xmlns:cx6="http://schemas.microsoft.com/office/drawing/2016/5/12/chartex" xmlns:cx7="http://schemas.microsoft.com/office/drawing/2016/5/13/chartex" xmlns:cx8="http://schemas.microsoft.com/office/drawing/2016/5/14/chartex" xmlns:mc="http://schemas.openxmlformats.org/markup-compatibility/2006" xmlns:aink="http://schemas.microsoft.com/office/drawing/2016/ink" xmlns:am3d="http://schemas.microsoft.com/office/drawing/2017/model3d" xmlns:o="urn:schemas-microsoft-com:office:office" xmlns:oel="http://schemas.microsoft.com/office/2019/extlst" xmlns:r="http://schemas.openxmlformats.org/officeDocument/2006/relationships" xmlns:m="http://schemas.openxmlformats.org/officeDocument/2006/math" xmlns:v="urn:schemas-microsoft-com:vml" xmlns:wp14="http://schemas.microsoft.com/office/word/2010/wordprocessingDrawing" xmlns:wp="http://schemas.openxmlformats.org/drawingml/2006/wordprocessingDrawing" xmlns:w10="urn:schemas-microsoft-com:office:word" xmlns:w="http://schemas.openxmlformats.org/wordprocessingml/2006/main" xmlns:w14="http://schemas.microsoft.com/office/word/2010/wordml" xmlns:w15="http://schemas.microsoft.com/office/word/2012/wordml" xmlns:w16cex="http://schemas.microsoft.com/office/word/2018/wordml/cex" xmlns:w16cid="http://schemas.microsoft.com/office/word/2016/wordml/cid" xmlns:w16="http://schemas.microsoft.com/office/word/2018/wordml" xmlns:w16du="http://schemas.microsoft.com/office/word/2023/wordml/word16du" xmlns:w16sdtdh="http://schemas.microsoft.com/office/word/2020/wordml/sdtdatahash" xmlns:w16sdtfl="http://schemas.microsoft.com/office/word/2024/wordml/sdtformatlock" xmlns:w16se="http://schemas.microsoft.com/office/word/2015/wordml/symex" xmlns:wpg="http://schemas.microsoft.com/office/word/2010/wordprocessingGroup" xmlns:wpi="http://schemas.microsoft.com/office/word/2010/wordprocessingInk" xmlns:wne="http://schemas.microsoft.com/office/word/2006/wordml" xmlns:wps="http://schemas.microsoft.com/office/word/2010/wordprocessingShape" mc:Ignorable="w14 w15 w16se w16cid w16 w16cex w16sdtdh w16sdtfl w16du wp14">
+<w:ftr xmlns:wpc="http://schemas.microsoft.com/office/word/2010/wordprocessingCanvas" xmlns:cx="http://schemas.microsoft.com/office/drawing/2014/chartex" xmlns:cx1="http://schemas.microsoft.com/office/drawing/2015/9/8/chartex" xmlns:cx2="http://schemas.microsoft.com/office/drawing/2015/10/21/chartex" xmlns:cx3="http://schemas.microsoft.com/office/drawing/2016/5/9/chartex" xmlns:cx4="http://schemas.microsoft.com/office/drawing/2016/5/10/chartex" xmlns:cx5="http://schemas.microsoft.com/office/drawing/2016/5/11/chartex" xmlns:cx6="http://schemas.microsoft.com/office/drawing/2016/5/12/chartex" xmlns:cx7="http://schemas.microsoft.com/office/drawing/2016/5/13/chartex" xmlns:cx8="http://schemas.microsoft.com/office/drawing/2016/5/14/chartex" xmlns:mc="http://schemas.openxmlformats.org/markup-compatibility/2006" xmlns:aink="http://schemas.microsoft.com/office/drawing/2016/ink" xmlns:am3d="http://schemas.microsoft.com/office/drawing/2017/model3d" xmlns:o="urn:schemas-microsoft-com:office:office" xmlns:oel="http://schemas.microsoft.com/office/2019/extlst" xmlns:r="http://schemas.openxmlformats.org/officeDocument/2006/relationships" xmlns:m="http://schemas.openxmlformats.org/officeDocument/2006/math" xmlns:v="urn:schemas-microsoft-com:vml" xmlns:wp14="http://schemas.microsoft.com/office/word/2010/wordprocessingDrawing" xmlns:wp="http://schemas.openxmlformats.org/drawingml/2006/wordprocessingDrawing" xmlns:w10="urn:schemas-microsoft-com:office:word" xmlns:w="http://schemas.openxmlformats.org/wordprocessingml/2006/main" xmlns:w14="http://schemas.microsoft.com/office/word/2010/wordml" xmlns:w15="http://schemas.microsoft.com/office/word/2012/wordml" xmlns:w16cei="http://schemas.microsoft.com/office/word/2026/wordml/cei" xmlns:w16cex="http://schemas.microsoft.com/office/word/2018/wordml/cex" xmlns:w16cid="http://schemas.microsoft.com/office/word/2016/wordml/cid" xmlns:w16="http://schemas.microsoft.com/office/word/2018/wordml" xmlns:w16du="http://schemas.microsoft.com/office/word/2023/wordml/word16du" xmlns:w16sdtdh="http://schemas.microsoft.com/office/word/2020/wordml/sdtdatahash" xmlns:w16sdtfl="http://schemas.microsoft.com/office/word/2024/wordml/sdtformatlock" xmlns:w16se="http://schemas.microsoft.com/office/word/2015/wordml/symex" xmlns:wpg="http://schemas.microsoft.com/office/word/2010/wordprocessingGroup" xmlns:wpi="http://schemas.microsoft.com/office/word/2010/wordprocessingInk" xmlns:wne="http://schemas.microsoft.com/office/word/2006/wordml" xmlns:wps="http://schemas.microsoft.com/office/word/2010/wordprocessingShape" mc:Ignorable="w14 w15 w16se w16cid w16 w16cex w16sdtdh w16sdtfl w16du wp14">
   <w:sdt>
     <w:sdtPr>
       <w:id w:val="-2056690798"/>
@@ -890,7 +1058,7 @@
 </file>
 
 <file path=word/footnotes.xml><?xml version="1.0" encoding="utf-8"?>
-<w:footnotes xmlns:wpc="http://schemas.microsoft.com/office/word/2010/wordprocessingCanvas" xmlns:cx="http://schemas.microsoft.com/office/drawing/2014/chartex" xmlns:cx1="http://schemas.microsoft.com/office/drawing/2015/9/8/chartex" xmlns:cx2="http://schemas.microsoft.com/office/drawing/2015/10/21/chartex" xmlns:cx3="http://schemas.microsoft.com/office/drawing/2016/5/9/chartex" xmlns:cx4="http://schemas.microsoft.com/office/drawing/2016/5/10/chartex" xmlns:cx5="http://schemas.microsoft.com/office/drawing/2016/5/11/chartex" xmlns:cx6="http://schemas.microsoft.com/office/drawing/2016/5/12/chartex" xmlns:cx7="http://schemas.microsoft.com/office/drawing/2016/5/13/chartex" xmlns:cx8="http://schemas.microsoft.com/office/drawing/2016/5/14/chartex" xmlns:mc="http://schemas.openxmlformats.org/markup-compatibility/2006" xmlns:aink="http://schemas.microsoft.com/office/drawing/2016/ink" xmlns:am3d="http://schemas.microsoft.com/office/drawing/2017/model3d" xmlns:o="urn:schemas-microsoft-com:office:office" xmlns:oel="http://schemas.microsoft.com/office/2019/extlst" xmlns:r="http://schemas.openxmlformats.org/officeDocument/2006/relationships" xmlns:m="http://schemas.openxmlformats.org/officeDocument/2006/math" xmlns:v="urn:schemas-microsoft-com:vml" xmlns:wp14="http://schemas.microsoft.com/office/word/2010/wordprocessingDrawing" xmlns:wp="http://schemas.openxmlformats.org/drawingml/2006/wordprocessingDrawing" xmlns:w10="urn:schemas-microsoft-com:office:word" xmlns:w="http://schemas.openxmlformats.org/wordprocessingml/2006/main" xmlns:w14="http://schemas.microsoft.com/office/word/2010/wordml" xmlns:w15="http://schemas.microsoft.com/office/word/2012/wordml" xmlns:w16cex="http://schemas.microsoft.com/office/word/2018/wordml/cex" xmlns:w16cid="http://schemas.microsoft.com/office/word/2016/wordml/cid" xmlns:w16="http://schemas.microsoft.com/office/word/2018/wordml" xmlns:w16du="http://schemas.microsoft.com/office/word/2023/wordml/word16du" xmlns:w16sdtdh="http://schemas.microsoft.com/office/word/2020/wordml/sdtdatahash" xmlns:w16sdtfl="http://schemas.microsoft.com/office/word/2024/wordml/sdtformatlock" xmlns:w16se="http://schemas.microsoft.com/office/word/2015/wordml/symex" xmlns:wpg="http://schemas.microsoft.com/office/word/2010/wordprocessingGroup" xmlns:wpi="http://schemas.microsoft.com/office/word/2010/wordprocessingInk" xmlns:wne="http://schemas.microsoft.com/office/word/2006/wordml" xmlns:wps="http://schemas.microsoft.com/office/word/2010/wordprocessingShape" mc:Ignorable="w14 w15 w16se w16cid w16 w16cex w16sdtdh w16sdtfl w16du wp14">
+<w:footnotes xmlns:wpc="http://schemas.microsoft.com/office/word/2010/wordprocessingCanvas" xmlns:cx="http://schemas.microsoft.com/office/drawing/2014/chartex" xmlns:cx1="http://schemas.microsoft.com/office/drawing/2015/9/8/chartex" xmlns:cx2="http://schemas.microsoft.com/office/drawing/2015/10/21/chartex" xmlns:cx3="http://schemas.microsoft.com/office/drawing/2016/5/9/chartex" xmlns:cx4="http://schemas.microsoft.com/office/drawing/2016/5/10/chartex" xmlns:cx5="http://schemas.microsoft.com/office/drawing/2016/5/11/chartex" xmlns:cx6="http://schemas.microsoft.com/office/drawing/2016/5/12/chartex" xmlns:cx7="http://schemas.microsoft.com/office/drawing/2016/5/13/chartex" xmlns:cx8="http://schemas.microsoft.com/office/drawing/2016/5/14/chartex" xmlns:mc="http://schemas.openxmlformats.org/markup-compatibility/2006" xmlns:aink="http://schemas.microsoft.com/office/drawing/2016/ink" xmlns:am3d="http://schemas.microsoft.com/office/drawing/2017/model3d" xmlns:o="urn:schemas-microsoft-com:office:office" xmlns:oel="http://schemas.microsoft.com/office/2019/extlst" xmlns:r="http://schemas.openxmlformats.org/officeDocument/2006/relationships" xmlns:m="http://schemas.openxmlformats.org/officeDocument/2006/math" xmlns:v="urn:schemas-microsoft-com:vml" xmlns:wp14="http://schemas.microsoft.com/office/word/2010/wordprocessingDrawing" xmlns:wp="http://schemas.openxmlformats.org/drawingml/2006/wordprocessingDrawing" xmlns:w10="urn:schemas-microsoft-com:office:word" xmlns:w="http://schemas.openxmlformats.org/wordprocessingml/2006/main" xmlns:w14="http://schemas.microsoft.com/office/word/2010/wordml" xmlns:w15="http://schemas.microsoft.com/office/word/2012/wordml" xmlns:w16cei="http://schemas.microsoft.com/office/word/2026/wordml/cei" xmlns:w16cex="http://schemas.microsoft.com/office/word/2018/wordml/cex" xmlns:w16cid="http://schemas.microsoft.com/office/word/2016/wordml/cid" xmlns:w16="http://schemas.microsoft.com/office/word/2018/wordml" xmlns:w16du="http://schemas.microsoft.com/office/word/2023/wordml/word16du" xmlns:w16sdtdh="http://schemas.microsoft.com/office/word/2020/wordml/sdtdatahash" xmlns:w16sdtfl="http://schemas.microsoft.com/office/word/2024/wordml/sdtformatlock" xmlns:w16se="http://schemas.microsoft.com/office/word/2015/wordml/symex" xmlns:wpg="http://schemas.microsoft.com/office/word/2010/wordprocessingGroup" xmlns:wpi="http://schemas.microsoft.com/office/word/2010/wordprocessingInk" xmlns:wne="http://schemas.microsoft.com/office/word/2006/wordml" xmlns:wps="http://schemas.microsoft.com/office/word/2010/wordprocessingShape" mc:Ignorable="w14 w15 w16se w16cid w16 w16cex w16sdtdh w16sdtfl w16du wp14">
   <w:footnote w:type="separator" w:id="-1">
     <w:p>
       <w:pPr>
@@ -915,7 +1083,7 @@
 </file>
 
 <file path=word/numbering.xml><?xml version="1.0" encoding="utf-8"?>
-<w:numbering xmlns:wpc="http://schemas.microsoft.com/office/word/2010/wordprocessingCanvas" xmlns:cx="http://schemas.microsoft.com/office/drawing/2014/chartex" xmlns:cx1="http://schemas.microsoft.com/office/drawing/2015/9/8/chartex" xmlns:cx2="http://schemas.microsoft.com/office/drawing/2015/10/21/chartex" xmlns:cx3="http://schemas.microsoft.com/office/drawing/2016/5/9/chartex" xmlns:cx4="http://schemas.microsoft.com/office/drawing/2016/5/10/chartex" xmlns:cx5="http://schemas.microsoft.com/office/drawing/2016/5/11/chartex" xmlns:cx6="http://schemas.microsoft.com/office/drawing/2016/5/12/chartex" xmlns:cx7="http://schemas.microsoft.com/office/drawing/2016/5/13/chartex" xmlns:cx8="http://schemas.microsoft.com/office/drawing/2016/5/14/chartex" xmlns:mc="http://schemas.openxmlformats.org/markup-compatibility/2006" xmlns:aink="http://schemas.microsoft.com/office/drawing/2016/ink" xmlns:am3d="http://schemas.microsoft.com/office/drawing/2017/model3d" xmlns:o="urn:schemas-microsoft-com:office:office" xmlns:oel="http://schemas.microsoft.com/office/2019/extlst" xmlns:r="http://schemas.openxmlformats.org/officeDocument/2006/relationships" xmlns:m="http://schemas.openxmlformats.org/officeDocument/2006/math" xmlns:v="urn:schemas-microsoft-com:vml" xmlns:wp14="http://schemas.microsoft.com/office/word/2010/wordprocessingDrawing" xmlns:wp="http://schemas.openxmlformats.org/drawingml/2006/wordprocessingDrawing" xmlns:w10="urn:schemas-microsoft-com:office:word" xmlns:w="http://schemas.openxmlformats.org/wordprocessingml/2006/main" xmlns:w14="http://schemas.microsoft.com/office/word/2010/wordml" xmlns:w15="http://schemas.microsoft.com/office/word/2012/wordml" xmlns:w16cex="http://schemas.microsoft.com/office/word/2018/wordml/cex" xmlns:w16cid="http://schemas.microsoft.com/office/word/2016/wordml/cid" xmlns:w16="http://schemas.microsoft.com/office/word/2018/wordml" xmlns:w16du="http://schemas.microsoft.com/office/word/2023/wordml/word16du" xmlns:w16sdtdh="http://schemas.microsoft.com/office/word/2020/wordml/sdtdatahash" xmlns:w16sdtfl="http://schemas.microsoft.com/office/word/2024/wordml/sdtformatlock" xmlns:w16se="http://schemas.microsoft.com/office/word/2015/wordml/symex" xmlns:wpg="http://schemas.microsoft.com/office/word/2010/wordprocessingGroup" xmlns:wpi="http://schemas.microsoft.com/office/word/2010/wordprocessingInk" xmlns:wne="http://schemas.microsoft.com/office/word/2006/wordml" xmlns:wps="http://schemas.microsoft.com/office/word/2010/wordprocessingShape" mc:Ignorable="w14 w15 w16se w16cid w16 w16cex w16sdtdh w16sdtfl w16du wp14">
+<w:numbering xmlns:wpc="http://schemas.microsoft.com/office/word/2010/wordprocessingCanvas" xmlns:cx="http://schemas.microsoft.com/office/drawing/2014/chartex" xmlns:cx1="http://schemas.microsoft.com/office/drawing/2015/9/8/chartex" xmlns:cx2="http://schemas.microsoft.com/office/drawing/2015/10/21/chartex" xmlns:cx3="http://schemas.microsoft.com/office/drawing/2016/5/9/chartex" xmlns:cx4="http://schemas.microsoft.com/office/drawing/2016/5/10/chartex" xmlns:cx5="http://schemas.microsoft.com/office/drawing/2016/5/11/chartex" xmlns:cx6="http://schemas.microsoft.com/office/drawing/2016/5/12/chartex" xmlns:cx7="http://schemas.microsoft.com/office/drawing/2016/5/13/chartex" xmlns:cx8="http://schemas.microsoft.com/office/drawing/2016/5/14/chartex" xmlns:mc="http://schemas.openxmlformats.org/markup-compatibility/2006" xmlns:aink="http://schemas.microsoft.com/office/drawing/2016/ink" xmlns:am3d="http://schemas.microsoft.com/office/drawing/2017/model3d" xmlns:o="urn:schemas-microsoft-com:office:office" xmlns:oel="http://schemas.microsoft.com/office/2019/extlst" xmlns:r="http://schemas.openxmlformats.org/officeDocument/2006/relationships" xmlns:m="http://schemas.openxmlformats.org/officeDocument/2006/math" xmlns:v="urn:schemas-microsoft-com:vml" xmlns:wp14="http://schemas.microsoft.com/office/word/2010/wordprocessingDrawing" xmlns:wp="http://schemas.openxmlformats.org/drawingml/2006/wordprocessingDrawing" xmlns:w10="urn:schemas-microsoft-com:office:word" xmlns:w="http://schemas.openxmlformats.org/wordprocessingml/2006/main" xmlns:w14="http://schemas.microsoft.com/office/word/2010/wordml" xmlns:w15="http://schemas.microsoft.com/office/word/2012/wordml" xmlns:w16cei="http://schemas.microsoft.com/office/word/2026/wordml/cei" xmlns:w16cex="http://schemas.microsoft.com/office/word/2018/wordml/cex" xmlns:w16cid="http://schemas.microsoft.com/office/word/2016/wordml/cid" xmlns:w16="http://schemas.microsoft.com/office/word/2018/wordml" xmlns:w16du="http://schemas.microsoft.com/office/word/2023/wordml/word16du" xmlns:w16sdtdh="http://schemas.microsoft.com/office/word/2020/wordml/sdtdatahash" xmlns:w16sdtfl="http://schemas.microsoft.com/office/word/2024/wordml/sdtformatlock" xmlns:w16se="http://schemas.microsoft.com/office/word/2015/wordml/symex" xmlns:wpg="http://schemas.microsoft.com/office/word/2010/wordprocessingGroup" xmlns:wpi="http://schemas.microsoft.com/office/word/2010/wordprocessingInk" xmlns:wne="http://schemas.microsoft.com/office/word/2006/wordml" xmlns:wps="http://schemas.microsoft.com/office/word/2010/wordprocessingShape" mc:Ignorable="w14 w15 w16se w16cid w16 w16cex w16sdtdh w16sdtfl w16du wp14">
   <w:abstractNum w:abstractNumId="0" w15:restartNumberingAfterBreak="0">
     <w:nsid w:val="01C75471"/>
     <w:multiLevelType w:val="multilevel"/>
@@ -3676,6 +3844,155 @@
     </w:lvl>
   </w:abstractNum>
   <w:abstractNum w:abstractNumId="19" w15:restartNumberingAfterBreak="0">
+    <w:nsid w:val="5ED84BEA"/>
+    <w:multiLevelType w:val="multilevel"/>
+    <w:tmpl w:val="381CE474"/>
+    <w:lvl w:ilvl="0">
+      <w:start w:val="1"/>
+      <w:numFmt w:val="bullet"/>
+      <w:lvlText w:val=""/>
+      <w:lvlJc w:val="left"/>
+      <w:pPr>
+        <w:tabs>
+          <w:tab w:val="num" w:pos="720"/>
+        </w:tabs>
+        <w:ind w:left="720" w:hanging="360"/>
+      </w:pPr>
+      <w:rPr>
+        <w:rFonts w:ascii="Symbol" w:hAnsi="Symbol" w:hint="default"/>
+        <w:sz w:val="20"/>
+      </w:rPr>
+    </w:lvl>
+    <w:lvl w:ilvl="1" w:tentative="1">
+      <w:start w:val="1"/>
+      <w:numFmt w:val="bullet"/>
+      <w:lvlText w:val="o"/>
+      <w:lvlJc w:val="left"/>
+      <w:pPr>
+        <w:tabs>
+          <w:tab w:val="num" w:pos="1440"/>
+        </w:tabs>
+        <w:ind w:left="1440" w:hanging="360"/>
+      </w:pPr>
+      <w:rPr>
+        <w:rFonts w:ascii="Courier New" w:hAnsi="Courier New" w:hint="default"/>
+        <w:sz w:val="20"/>
+      </w:rPr>
+    </w:lvl>
+    <w:lvl w:ilvl="2" w:tentative="1">
+      <w:start w:val="1"/>
+      <w:numFmt w:val="bullet"/>
+      <w:lvlText w:val=""/>
+      <w:lvlJc w:val="left"/>
+      <w:pPr>
+        <w:tabs>
+          <w:tab w:val="num" w:pos="2160"/>
+        </w:tabs>
+        <w:ind w:left="2160" w:hanging="360"/>
+      </w:pPr>
+      <w:rPr>
+        <w:rFonts w:ascii="Wingdings" w:hAnsi="Wingdings" w:hint="default"/>
+        <w:sz w:val="20"/>
+      </w:rPr>
+    </w:lvl>
+    <w:lvl w:ilvl="3" w:tentative="1">
+      <w:start w:val="1"/>
+      <w:numFmt w:val="bullet"/>
+      <w:lvlText w:val=""/>
+      <w:lvlJc w:val="left"/>
+      <w:pPr>
+        <w:tabs>
+          <w:tab w:val="num" w:pos="2880"/>
+        </w:tabs>
+        <w:ind w:left="2880" w:hanging="360"/>
+      </w:pPr>
+      <w:rPr>
+        <w:rFonts w:ascii="Wingdings" w:hAnsi="Wingdings" w:hint="default"/>
+        <w:sz w:val="20"/>
+      </w:rPr>
+    </w:lvl>
+    <w:lvl w:ilvl="4" w:tentative="1">
+      <w:start w:val="1"/>
+      <w:numFmt w:val="bullet"/>
+      <w:lvlText w:val=""/>
+      <w:lvlJc w:val="left"/>
+      <w:pPr>
+        <w:tabs>
+          <w:tab w:val="num" w:pos="3600"/>
+        </w:tabs>
+        <w:ind w:left="3600" w:hanging="360"/>
+      </w:pPr>
+      <w:rPr>
+        <w:rFonts w:ascii="Wingdings" w:hAnsi="Wingdings" w:hint="default"/>
+        <w:sz w:val="20"/>
+      </w:rPr>
+    </w:lvl>
+    <w:lvl w:ilvl="5" w:tentative="1">
+      <w:start w:val="1"/>
+      <w:numFmt w:val="bullet"/>
+      <w:lvlText w:val=""/>
+      <w:lvlJc w:val="left"/>
+      <w:pPr>
+        <w:tabs>
+          <w:tab w:val="num" w:pos="4320"/>
+        </w:tabs>
+        <w:ind w:left="4320" w:hanging="360"/>
+      </w:pPr>
+      <w:rPr>
+        <w:rFonts w:ascii="Wingdings" w:hAnsi="Wingdings" w:hint="default"/>
+        <w:sz w:val="20"/>
+      </w:rPr>
+    </w:lvl>
+    <w:lvl w:ilvl="6" w:tentative="1">
+      <w:start w:val="1"/>
+      <w:numFmt w:val="bullet"/>
+      <w:lvlText w:val=""/>
+      <w:lvlJc w:val="left"/>
+      <w:pPr>
+        <w:tabs>
+          <w:tab w:val="num" w:pos="5040"/>
+        </w:tabs>
+        <w:ind w:left="5040" w:hanging="360"/>
+      </w:pPr>
+      <w:rPr>
+        <w:rFonts w:ascii="Wingdings" w:hAnsi="Wingdings" w:hint="default"/>
+        <w:sz w:val="20"/>
+      </w:rPr>
+    </w:lvl>
+    <w:lvl w:ilvl="7" w:tentative="1">
+      <w:start w:val="1"/>
+      <w:numFmt w:val="bullet"/>
+      <w:lvlText w:val=""/>
+      <w:lvlJc w:val="left"/>
+      <w:pPr>
+        <w:tabs>
+          <w:tab w:val="num" w:pos="5760"/>
+        </w:tabs>
+        <w:ind w:left="5760" w:hanging="360"/>
+      </w:pPr>
+      <w:rPr>
+        <w:rFonts w:ascii="Wingdings" w:hAnsi="Wingdings" w:hint="default"/>
+        <w:sz w:val="20"/>
+      </w:rPr>
+    </w:lvl>
+    <w:lvl w:ilvl="8" w:tentative="1">
+      <w:start w:val="1"/>
+      <w:numFmt w:val="bullet"/>
+      <w:lvlText w:val=""/>
+      <w:lvlJc w:val="left"/>
+      <w:pPr>
+        <w:tabs>
+          <w:tab w:val="num" w:pos="6480"/>
+        </w:tabs>
+        <w:ind w:left="6480" w:hanging="360"/>
+      </w:pPr>
+      <w:rPr>
+        <w:rFonts w:ascii="Wingdings" w:hAnsi="Wingdings" w:hint="default"/>
+        <w:sz w:val="20"/>
+      </w:rPr>
+    </w:lvl>
+  </w:abstractNum>
+  <w:abstractNum w:abstractNumId="20" w15:restartNumberingAfterBreak="0">
     <w:nsid w:val="5F0C1157"/>
     <w:multiLevelType w:val="multilevel"/>
     <w:tmpl w:val="F87EB08C"/>
@@ -3824,7 +4141,7 @@
       </w:rPr>
     </w:lvl>
   </w:abstractNum>
-  <w:abstractNum w:abstractNumId="20" w15:restartNumberingAfterBreak="0">
+  <w:abstractNum w:abstractNumId="21" w15:restartNumberingAfterBreak="0">
     <w:nsid w:val="65105B03"/>
     <w:multiLevelType w:val="multilevel"/>
     <w:tmpl w:val="B2005F72"/>
@@ -3973,7 +4290,7 @@
       </w:rPr>
     </w:lvl>
   </w:abstractNum>
-  <w:abstractNum w:abstractNumId="21" w15:restartNumberingAfterBreak="0">
+  <w:abstractNum w:abstractNumId="22" w15:restartNumberingAfterBreak="0">
     <w:nsid w:val="676A13E4"/>
     <w:multiLevelType w:val="multilevel"/>
     <w:tmpl w:val="8466A7E6"/>
@@ -4122,7 +4439,7 @@
       </w:rPr>
     </w:lvl>
   </w:abstractNum>
-  <w:abstractNum w:abstractNumId="22" w15:restartNumberingAfterBreak="0">
+  <w:abstractNum w:abstractNumId="23" w15:restartNumberingAfterBreak="0">
     <w:nsid w:val="6C58439B"/>
     <w:multiLevelType w:val="multilevel"/>
     <w:tmpl w:val="88882D8E"/>
@@ -4271,7 +4588,7 @@
       </w:rPr>
     </w:lvl>
   </w:abstractNum>
-  <w:abstractNum w:abstractNumId="23" w15:restartNumberingAfterBreak="0">
+  <w:abstractNum w:abstractNumId="24" w15:restartNumberingAfterBreak="0">
     <w:nsid w:val="6C8A2DF6"/>
     <w:multiLevelType w:val="multilevel"/>
     <w:tmpl w:val="CF3CE940"/>
@@ -4388,7 +4705,7 @@
       </w:pPr>
     </w:lvl>
   </w:abstractNum>
-  <w:abstractNum w:abstractNumId="24" w15:restartNumberingAfterBreak="0">
+  <w:abstractNum w:abstractNumId="25" w15:restartNumberingAfterBreak="0">
     <w:nsid w:val="701A7801"/>
     <w:multiLevelType w:val="multilevel"/>
     <w:tmpl w:val="26EC794E"/>
@@ -4537,7 +4854,7 @@
       </w:rPr>
     </w:lvl>
   </w:abstractNum>
-  <w:abstractNum w:abstractNumId="25" w15:restartNumberingAfterBreak="0">
+  <w:abstractNum w:abstractNumId="26" w15:restartNumberingAfterBreak="0">
     <w:nsid w:val="72ED4FCA"/>
     <w:multiLevelType w:val="multilevel"/>
     <w:tmpl w:val="6C907180"/>
@@ -4686,7 +5003,7 @@
       </w:rPr>
     </w:lvl>
   </w:abstractNum>
-  <w:abstractNum w:abstractNumId="26" w15:restartNumberingAfterBreak="0">
+  <w:abstractNum w:abstractNumId="27" w15:restartNumberingAfterBreak="0">
     <w:nsid w:val="73445726"/>
     <w:multiLevelType w:val="multilevel"/>
     <w:tmpl w:val="33DE3DCC"/>
@@ -4835,7 +5152,7 @@
       </w:rPr>
     </w:lvl>
   </w:abstractNum>
-  <w:abstractNum w:abstractNumId="27" w15:restartNumberingAfterBreak="0">
+  <w:abstractNum w:abstractNumId="28" w15:restartNumberingAfterBreak="0">
     <w:nsid w:val="739A2823"/>
     <w:multiLevelType w:val="multilevel"/>
     <w:tmpl w:val="F488CC1A"/>
@@ -4984,7 +5301,7 @@
       </w:rPr>
     </w:lvl>
   </w:abstractNum>
-  <w:abstractNum w:abstractNumId="28" w15:restartNumberingAfterBreak="0">
+  <w:abstractNum w:abstractNumId="29" w15:restartNumberingAfterBreak="0">
     <w:nsid w:val="7889701B"/>
     <w:multiLevelType w:val="multilevel"/>
     <w:tmpl w:val="0930E654"/>
@@ -5133,7 +5450,7 @@
       </w:rPr>
     </w:lvl>
   </w:abstractNum>
-  <w:abstractNum w:abstractNumId="29" w15:restartNumberingAfterBreak="0">
+  <w:abstractNum w:abstractNumId="30" w15:restartNumberingAfterBreak="0">
     <w:nsid w:val="7C3608AF"/>
     <w:multiLevelType w:val="multilevel"/>
     <w:tmpl w:val="7F1CDD82"/>
@@ -5289,19 +5606,19 @@
     <w:abstractNumId w:val="15"/>
   </w:num>
   <w:num w:numId="3" w16cid:durableId="1952515153">
-    <w:abstractNumId w:val="22"/>
+    <w:abstractNumId w:val="23"/>
   </w:num>
   <w:num w:numId="4" w16cid:durableId="773331134">
     <w:abstractNumId w:val="10"/>
   </w:num>
   <w:num w:numId="5" w16cid:durableId="290140255">
-    <w:abstractNumId w:val="20"/>
+    <w:abstractNumId w:val="21"/>
   </w:num>
   <w:num w:numId="6" w16cid:durableId="694308228">
     <w:abstractNumId w:val="17"/>
   </w:num>
   <w:num w:numId="7" w16cid:durableId="928273567">
-    <w:abstractNumId w:val="29"/>
+    <w:abstractNumId w:val="30"/>
   </w:num>
   <w:num w:numId="8" w16cid:durableId="2130590713">
     <w:abstractNumId w:val="1"/>
@@ -5313,7 +5630,7 @@
     <w:abstractNumId w:val="9"/>
   </w:num>
   <w:num w:numId="11" w16cid:durableId="1666515730">
-    <w:abstractNumId w:val="23"/>
+    <w:abstractNumId w:val="24"/>
   </w:num>
   <w:num w:numId="12" w16cid:durableId="565989689">
     <w:abstractNumId w:val="0"/>
@@ -5325,28 +5642,28 @@
     <w:abstractNumId w:val="4"/>
   </w:num>
   <w:num w:numId="15" w16cid:durableId="962729937">
-    <w:abstractNumId w:val="19"/>
+    <w:abstractNumId w:val="20"/>
   </w:num>
   <w:num w:numId="16" w16cid:durableId="520820621">
-    <w:abstractNumId w:val="26"/>
+    <w:abstractNumId w:val="27"/>
   </w:num>
   <w:num w:numId="17" w16cid:durableId="363796417">
     <w:abstractNumId w:val="6"/>
   </w:num>
   <w:num w:numId="18" w16cid:durableId="1539007811">
-    <w:abstractNumId w:val="27"/>
+    <w:abstractNumId w:val="28"/>
   </w:num>
   <w:num w:numId="19" w16cid:durableId="65030892">
     <w:abstractNumId w:val="2"/>
   </w:num>
   <w:num w:numId="20" w16cid:durableId="1821460736">
-    <w:abstractNumId w:val="25"/>
+    <w:abstractNumId w:val="26"/>
   </w:num>
   <w:num w:numId="21" w16cid:durableId="95713318">
     <w:abstractNumId w:val="13"/>
   </w:num>
   <w:num w:numId="22" w16cid:durableId="1431581226">
-    <w:abstractNumId w:val="21"/>
+    <w:abstractNumId w:val="22"/>
   </w:num>
   <w:num w:numId="23" w16cid:durableId="929123596">
     <w:abstractNumId w:val="8"/>
@@ -5355,7 +5672,7 @@
     <w:abstractNumId w:val="16"/>
   </w:num>
   <w:num w:numId="25" w16cid:durableId="1635258419">
-    <w:abstractNumId w:val="28"/>
+    <w:abstractNumId w:val="29"/>
   </w:num>
   <w:num w:numId="26" w16cid:durableId="2079472527">
     <w:abstractNumId w:val="5"/>
@@ -5367,10 +5684,13 @@
     <w:abstractNumId w:val="14"/>
   </w:num>
   <w:num w:numId="29" w16cid:durableId="526524515">
-    <w:abstractNumId w:val="24"/>
+    <w:abstractNumId w:val="25"/>
   </w:num>
   <w:num w:numId="30" w16cid:durableId="388571659">
     <w:abstractNumId w:val="12"/>
+  </w:num>
+  <w:num w:numId="31" w16cid:durableId="1721856916">
+    <w:abstractNumId w:val="19"/>
   </w:num>
   <w:numIdMacAtCleanup w:val="23"/>
 </w:numbering>
@@ -5979,6 +6299,7 @@
   <w:style w:type="character" w:default="1" w:styleId="DefaultParagraphFont">
     <w:name w:val="Default Paragraph Font"/>
     <w:uiPriority w:val="1"/>
+    <w:semiHidden/>
     <w:unhideWhenUsed/>
   </w:style>
   <w:style w:type="table" w:default="1" w:styleId="TableNormal">

</xml_diff>